<commit_message>
Fill out general CV page
</commit_message>
<xml_diff>
--- a/Francesco_Giannicola_CV_General.docx
+++ b/Francesco_Giannicola_CV_General.docx
@@ -5,14 +5,14 @@
     <w:p>
       <w:pPr>
         <w:keepNext w:val="0"/>
-        <w:spacing w:before="0" w:after="30" w:line="240" w:lineRule="auto"/>
+        <w:spacing w:before="0" w:after="50" w:line="240" w:lineRule="auto"/>
       </w:pPr>
       <w:r>
         <w:rPr>
           <w:rFonts w:ascii="Arial" w:hAnsi="Arial"/>
           <w:b/>
           <w:color w:val="111111"/>
-          <w:sz w:val="40"/>
+          <w:sz w:val="46"/>
         </w:rPr>
         <w:t>FRANCESCO GIANNICOLA</w:t>
       </w:r>
@@ -20,13 +20,13 @@
     <w:p>
       <w:pPr>
         <w:keepNext w:val="0"/>
-        <w:spacing w:before="0" w:after="60" w:line="240" w:lineRule="auto"/>
+        <w:spacing w:before="0" w:after="120" w:line="240" w:lineRule="auto"/>
       </w:pPr>
       <w:r>
         <w:rPr>
           <w:rFonts w:ascii="Arial" w:hAnsi="Arial"/>
           <w:color w:val="555555"/>
-          <w:sz w:val="18"/>
+          <w:sz w:val="19"/>
         </w:rPr>
         <w:t>Cosenza, Italy / Europe</w:t>
       </w:r>
@@ -34,7 +34,7 @@
         <w:rPr>
           <w:rFonts w:ascii="Arial" w:hAnsi="Arial"/>
           <w:color w:val="555555"/>
-          <w:sz w:val="18"/>
+          <w:sz w:val="19"/>
         </w:rPr>
         <w:t xml:space="preserve">  |  </w:t>
       </w:r>
@@ -53,7 +53,7 @@
         <w:rPr>
           <w:rFonts w:ascii="Arial" w:hAnsi="Arial"/>
           <w:color w:val="555555"/>
-          <w:sz w:val="18"/>
+          <w:sz w:val="19"/>
         </w:rPr>
         <w:t xml:space="preserve">  |  </w:t>
       </w:r>
@@ -72,7 +72,7 @@
         <w:rPr>
           <w:rFonts w:ascii="Arial" w:hAnsi="Arial"/>
           <w:color w:val="555555"/>
-          <w:sz w:val="18"/>
+          <w:sz w:val="19"/>
         </w:rPr>
         <w:t xml:space="preserve">  |  </w:t>
       </w:r>
@@ -91,7 +91,7 @@
         <w:rPr>
           <w:rFonts w:ascii="Arial" w:hAnsi="Arial"/>
           <w:color w:val="555555"/>
-          <w:sz w:val="18"/>
+          <w:sz w:val="19"/>
         </w:rPr>
         <w:t xml:space="preserve">  |  </w:t>
       </w:r>
@@ -110,7 +110,7 @@
     <w:p>
       <w:pPr>
         <w:keepNext/>
-        <w:spacing w:before="80" w:after="60" w:line="240" w:lineRule="auto"/>
+        <w:spacing w:before="120" w:after="80" w:line="240" w:lineRule="auto"/>
         <w:pBdr>
           <w:bottom w:val="single" w:sz="6" w:space="2" w:color="A0A0A0"/>
         </w:pBdr>
@@ -120,7 +120,7 @@
           <w:rFonts w:ascii="Arial" w:hAnsi="Arial"/>
           <w:b/>
           <w:color w:val="111111"/>
-          <w:sz w:val="21"/>
+          <w:sz w:val="22"/>
         </w:rPr>
         <w:t>EDUCATION</w:t>
       </w:r>
@@ -128,7 +128,7 @@
     <w:p>
       <w:pPr>
         <w:keepNext/>
-        <w:spacing w:before="46" w:after="4" w:line="240" w:lineRule="auto"/>
+        <w:spacing w:before="56" w:after="16" w:line="240" w:lineRule="auto"/>
         <w:tabs>
           <w:tab w:val="right" w:pos="10800"/>
         </w:tabs>
@@ -138,7 +138,7 @@
           <w:rFonts w:ascii="Arial" w:hAnsi="Arial"/>
           <w:b/>
           <w:color w:val="111111"/>
-          <w:sz w:val="20"/>
+          <w:sz w:val="21"/>
         </w:rPr>
         <w:t>Universita della Calabria - Cosenza, Italy</w:t>
       </w:r>
@@ -146,7 +146,7 @@
         <w:rPr>
           <w:rFonts w:ascii="Arial" w:hAnsi="Arial"/>
           <w:color w:val="555555"/>
-          <w:sz w:val="18"/>
+          <w:sz w:val="19"/>
         </w:rPr>
         <w:tab/>
         <w:t>Sep 2024 - Present</w:t>
@@ -155,14 +155,14 @@
     <w:p>
       <w:pPr>
         <w:keepNext/>
-        <w:spacing w:before="0" w:after="26" w:line="240" w:lineRule="auto"/>
+        <w:spacing w:before="0" w:after="40" w:line="240" w:lineRule="auto"/>
       </w:pPr>
       <w:r>
         <w:rPr>
           <w:rFonts w:ascii="Arial" w:hAnsi="Arial"/>
           <w:i/>
           <w:color w:val="555555"/>
-          <w:sz w:val="18"/>
+          <w:sz w:val="19"/>
         </w:rPr>
         <w:t>BSc in Computer Science &amp; Artificial Intelligence; expected graduation 2027</w:t>
       </w:r>
@@ -170,7 +170,7 @@
     <w:p>
       <w:pPr>
         <w:pStyle w:val="ListBullet"/>
-        <w:spacing w:before="4" w:after="12" w:line="245" w:lineRule="auto"/>
+        <w:spacing w:before="8" w:after="18" w:line="252" w:lineRule="auto"/>
         <w:ind w:left="317" w:hanging="173"/>
       </w:pPr>
       <w:r>
@@ -185,7 +185,7 @@
     <w:p>
       <w:pPr>
         <w:keepNext/>
-        <w:spacing w:before="80" w:after="60" w:line="240" w:lineRule="auto"/>
+        <w:spacing w:before="120" w:after="80" w:line="240" w:lineRule="auto"/>
         <w:pBdr>
           <w:bottom w:val="single" w:sz="6" w:space="2" w:color="A0A0A0"/>
         </w:pBdr>
@@ -195,7 +195,7 @@
           <w:rFonts w:ascii="Arial" w:hAnsi="Arial"/>
           <w:b/>
           <w:color w:val="111111"/>
-          <w:sz w:val="21"/>
+          <w:sz w:val="22"/>
         </w:rPr>
         <w:t>PROJECTS &amp; RESEARCH</w:t>
       </w:r>
@@ -203,7 +203,7 @@
     <w:p>
       <w:pPr>
         <w:keepNext/>
-        <w:spacing w:before="30" w:after="4" w:line="240" w:lineRule="auto"/>
+        <w:spacing w:before="56" w:after="16" w:line="240" w:lineRule="auto"/>
         <w:tabs>
           <w:tab w:val="right" w:pos="10800"/>
         </w:tabs>
@@ -213,7 +213,7 @@
           <w:rFonts w:ascii="Arial" w:hAnsi="Arial"/>
           <w:b/>
           <w:color w:val="111111"/>
-          <w:sz w:val="20"/>
+          <w:sz w:val="22"/>
         </w:rPr>
         <w:t>Jurevo</w:t>
       </w:r>
@@ -221,7 +221,7 @@
         <w:rPr>
           <w:rFonts w:ascii="Arial" w:hAnsi="Arial"/>
           <w:color w:val="555555"/>
-          <w:sz w:val="18"/>
+          <w:sz w:val="19"/>
         </w:rPr>
         <w:tab/>
         <w:t>2026 - Present</w:t>
@@ -230,14 +230,14 @@
     <w:p>
       <w:pPr>
         <w:keepNext/>
-        <w:spacing w:before="0" w:after="26" w:line="240" w:lineRule="auto"/>
+        <w:spacing w:before="0" w:after="40" w:line="240" w:lineRule="auto"/>
       </w:pPr>
       <w:r>
         <w:rPr>
           <w:rFonts w:ascii="Arial" w:hAnsi="Arial"/>
           <w:i/>
           <w:color w:val="555555"/>
-          <w:sz w:val="18"/>
+          <w:sz w:val="19"/>
         </w:rPr>
         <w:t>Full-stack AI legal workspace for Italian law firms</w:t>
       </w:r>
@@ -245,7 +245,7 @@
         <w:rPr>
           <w:rFonts w:ascii="Arial" w:hAnsi="Arial"/>
           <w:color w:val="555555"/>
-          <w:sz w:val="17"/>
+          <w:sz w:val="18"/>
         </w:rPr>
         <w:t xml:space="preserve">  |  </w:t>
       </w:r>
@@ -265,14 +265,14 @@
     <w:p>
       <w:pPr>
         <w:pStyle w:val="ListBullet"/>
-        <w:spacing w:before="4" w:after="12" w:line="245" w:lineRule="auto"/>
+        <w:spacing w:before="8" w:after="18" w:line="252" w:lineRule="auto"/>
         <w:ind w:left="317" w:hanging="173"/>
       </w:pPr>
       <w:r>
         <w:rPr>
           <w:rFonts w:ascii="Arial" w:hAnsi="Arial"/>
           <w:color w:val="111111"/>
-          <w:sz w:val="17"/>
+          <w:sz w:val="18"/>
         </w:rPr>
         <w:t>Founded and built a production AI legal workspace end to end: authenticated web app, backend API, native Expo mobile app, document workflows, billing, storage, and LLM provider routing in a TypeScript monorepo.</w:t>
       </w:r>
@@ -280,14 +280,14 @@
     <w:p>
       <w:pPr>
         <w:pStyle w:val="ListBullet"/>
-        <w:spacing w:before="4" w:after="12" w:line="245" w:lineRule="auto"/>
+        <w:spacing w:before="8" w:after="18" w:line="252" w:lineRule="auto"/>
         <w:ind w:left="317" w:hanging="173"/>
       </w:pPr>
       <w:r>
         <w:rPr>
           <w:rFonts w:ascii="Arial" w:hAnsi="Arial"/>
           <w:color w:val="111111"/>
-          <w:sz w:val="17"/>
+          <w:sz w:val="18"/>
         </w:rPr>
         <w:t>Owned backend-managed model credentials, Supabase auth, private R2/S3 storage, Stripe billing, workflow packs, CI checks, assistant drafting, tabular review, and document editing.</w:t>
       </w:r>
@@ -295,7 +295,7 @@
     <w:p>
       <w:pPr>
         <w:keepNext/>
-        <w:spacing w:before="30" w:after="4" w:line="240" w:lineRule="auto"/>
+        <w:spacing w:before="56" w:after="16" w:line="240" w:lineRule="auto"/>
         <w:tabs>
           <w:tab w:val="right" w:pos="10800"/>
         </w:tabs>
@@ -305,7 +305,7 @@
           <w:rFonts w:ascii="Arial" w:hAnsi="Arial"/>
           <w:b/>
           <w:color w:val="111111"/>
-          <w:sz w:val="20"/>
+          <w:sz w:val="22"/>
         </w:rPr>
         <w:t>TracePilot</w:t>
       </w:r>
@@ -313,14 +313,14 @@
     <w:p>
       <w:pPr>
         <w:keepNext/>
-        <w:spacing w:before="0" w:after="26" w:line="240" w:lineRule="auto"/>
+        <w:spacing w:before="0" w:after="40" w:line="240" w:lineRule="auto"/>
       </w:pPr>
       <w:r>
         <w:rPr>
           <w:rFonts w:ascii="Arial" w:hAnsi="Arial"/>
           <w:i/>
           <w:color w:val="555555"/>
-          <w:sz w:val="18"/>
+          <w:sz w:val="19"/>
         </w:rPr>
         <w:t>Reliability studio for computer-use agents</w:t>
       </w:r>
@@ -328,7 +328,7 @@
         <w:rPr>
           <w:rFonts w:ascii="Arial" w:hAnsi="Arial"/>
           <w:color w:val="555555"/>
-          <w:sz w:val="17"/>
+          <w:sz w:val="18"/>
         </w:rPr>
         <w:t xml:space="preserve">  |  </w:t>
       </w:r>
@@ -348,14 +348,14 @@
     <w:p>
       <w:pPr>
         <w:pStyle w:val="ListBullet"/>
-        <w:spacing w:before="4" w:after="12" w:line="245" w:lineRule="auto"/>
+        <w:spacing w:before="8" w:after="18" w:line="252" w:lineRule="auto"/>
         <w:ind w:left="317" w:hanging="173"/>
       </w:pPr>
       <w:r>
         <w:rPr>
           <w:rFonts w:ascii="Arial" w:hAnsi="Arial"/>
           <w:color w:val="111111"/>
-          <w:sz w:val="17"/>
+          <w:sz w:val="18"/>
         </w:rPr>
         <w:t>Built an open-source eval and reliability harness for browser agents: trace replay, step-level verification, stuck-loop detection, prompt-injection tests, OpenAI Responses and Anthropic Computer Use adapters, readiness gate, and SHA-256 evidence packs.</w:t>
       </w:r>
@@ -363,7 +363,7 @@
     <w:p>
       <w:pPr>
         <w:keepNext/>
-        <w:spacing w:before="30" w:after="4" w:line="240" w:lineRule="auto"/>
+        <w:spacing w:before="56" w:after="16" w:line="240" w:lineRule="auto"/>
         <w:tabs>
           <w:tab w:val="right" w:pos="10800"/>
         </w:tabs>
@@ -373,7 +373,7 @@
           <w:rFonts w:ascii="Arial" w:hAnsi="Arial"/>
           <w:b/>
           <w:color w:val="111111"/>
-          <w:sz w:val="20"/>
+          <w:sz w:val="22"/>
         </w:rPr>
         <w:t>Limes Axis &amp; limen</w:t>
       </w:r>
@@ -381,14 +381,14 @@
     <w:p>
       <w:pPr>
         <w:keepNext/>
-        <w:spacing w:before="0" w:after="26" w:line="240" w:lineRule="auto"/>
+        <w:spacing w:before="0" w:after="40" w:line="240" w:lineRule="auto"/>
       </w:pPr>
       <w:r>
         <w:rPr>
           <w:rFonts w:ascii="Arial" w:hAnsi="Arial"/>
           <w:i/>
           <w:color w:val="555555"/>
-          <w:sz w:val="18"/>
+          <w:sz w:val="19"/>
         </w:rPr>
         <w:t>Agent infrastructure and orchestration primitives</w:t>
       </w:r>
@@ -396,7 +396,7 @@
         <w:rPr>
           <w:rFonts w:ascii="Arial" w:hAnsi="Arial"/>
           <w:color w:val="555555"/>
-          <w:sz w:val="17"/>
+          <w:sz w:val="18"/>
         </w:rPr>
         <w:t xml:space="preserve">  |  </w:t>
       </w:r>
@@ -416,14 +416,14 @@
     <w:p>
       <w:pPr>
         <w:pStyle w:val="ListBullet"/>
-        <w:spacing w:before="4" w:after="12" w:line="245" w:lineRule="auto"/>
+        <w:spacing w:before="8" w:after="18" w:line="252" w:lineRule="auto"/>
         <w:ind w:left="317" w:hanging="173"/>
       </w:pPr>
       <w:r>
         <w:rPr>
           <w:rFonts w:ascii="Arial" w:hAnsi="Arial"/>
           <w:color w:val="111111"/>
-          <w:sz w:val="17"/>
+          <w:sz w:val="18"/>
         </w:rPr>
         <w:t>Built a self-hostable AI control plane for typed, permissioned, auditable human/agent workflows, plus orchestration primitives for routing tasks across models, roles, workflows, and LoRA adapters.</w:t>
       </w:r>
@@ -431,7 +431,7 @@
     <w:p>
       <w:pPr>
         <w:keepNext/>
-        <w:spacing w:before="30" w:after="4" w:line="240" w:lineRule="auto"/>
+        <w:spacing w:before="56" w:after="16" w:line="240" w:lineRule="auto"/>
         <w:tabs>
           <w:tab w:val="right" w:pos="10800"/>
         </w:tabs>
@@ -441,7 +441,7 @@
           <w:rFonts w:ascii="Arial" w:hAnsi="Arial"/>
           <w:b/>
           <w:color w:val="111111"/>
-          <w:sz w:val="20"/>
+          <w:sz w:val="22"/>
         </w:rPr>
         <w:t>TarsGPT</w:t>
       </w:r>
@@ -449,14 +449,14 @@
     <w:p>
       <w:pPr>
         <w:keepNext/>
-        <w:spacing w:before="0" w:after="26" w:line="240" w:lineRule="auto"/>
+        <w:spacing w:before="0" w:after="40" w:line="240" w:lineRule="auto"/>
       </w:pPr>
       <w:r>
         <w:rPr>
           <w:rFonts w:ascii="Arial" w:hAnsi="Arial"/>
           <w:i/>
           <w:color w:val="555555"/>
-          <w:sz w:val="18"/>
+          <w:sz w:val="19"/>
         </w:rPr>
         <w:t>Physical AI agent</w:t>
       </w:r>
@@ -464,7 +464,7 @@
         <w:rPr>
           <w:rFonts w:ascii="Arial" w:hAnsi="Arial"/>
           <w:color w:val="555555"/>
-          <w:sz w:val="17"/>
+          <w:sz w:val="18"/>
         </w:rPr>
         <w:t xml:space="preserve">  |  </w:t>
       </w:r>
@@ -484,14 +484,14 @@
     <w:p>
       <w:pPr>
         <w:pStyle w:val="ListBullet"/>
-        <w:spacing w:before="4" w:after="12" w:line="245" w:lineRule="auto"/>
+        <w:spacing w:before="8" w:after="18" w:line="252" w:lineRule="auto"/>
         <w:ind w:left="317" w:hanging="173"/>
       </w:pPr>
       <w:r>
         <w:rPr>
           <w:rFonts w:ascii="Arial" w:hAnsi="Arial"/>
           <w:color w:val="111111"/>
-          <w:sz w:val="17"/>
+          <w:sz w:val="18"/>
         </w:rPr>
         <w:t>Designed and built a TARS-inspired Raspberry Pi 5 robot with streaming LLM brain, tool-calling skills, balance-first gait, vision, memory, timers, music, home automation, and simulation mode.</w:t>
       </w:r>
@@ -499,7 +499,7 @@
     <w:p>
       <w:pPr>
         <w:keepNext/>
-        <w:spacing w:before="30" w:after="4" w:line="240" w:lineRule="auto"/>
+        <w:spacing w:before="56" w:after="16" w:line="240" w:lineRule="auto"/>
         <w:tabs>
           <w:tab w:val="right" w:pos="10800"/>
         </w:tabs>
@@ -509,7 +509,7 @@
           <w:rFonts w:ascii="Arial" w:hAnsi="Arial"/>
           <w:b/>
           <w:color w:val="111111"/>
-          <w:sz w:val="20"/>
+          <w:sz w:val="22"/>
         </w:rPr>
         <w:t>The Broadcast Ceiling / Learning Signal Density</w:t>
       </w:r>
@@ -517,7 +517,7 @@
         <w:rPr>
           <w:rFonts w:ascii="Arial" w:hAnsi="Arial"/>
           <w:color w:val="555555"/>
-          <w:sz w:val="18"/>
+          <w:sz w:val="19"/>
         </w:rPr>
         <w:tab/>
         <w:t>2026</w:t>
@@ -526,14 +526,14 @@
     <w:p>
       <w:pPr>
         <w:keepNext/>
-        <w:spacing w:before="0" w:after="26" w:line="240" w:lineRule="auto"/>
+        <w:spacing w:before="0" w:after="40" w:line="240" w:lineRule="auto"/>
       </w:pPr>
       <w:r>
         <w:rPr>
           <w:rFonts w:ascii="Arial" w:hAnsi="Arial"/>
           <w:i/>
           <w:color w:val="555555"/>
-          <w:sz w:val="18"/>
+          <w:sz w:val="19"/>
         </w:rPr>
         <w:t>RL research artifact, DOI: 10.5281/zenodo.20970205</w:t>
       </w:r>
@@ -541,7 +541,7 @@
         <w:rPr>
           <w:rFonts w:ascii="Arial" w:hAnsi="Arial"/>
           <w:color w:val="555555"/>
-          <w:sz w:val="17"/>
+          <w:sz w:val="18"/>
         </w:rPr>
         <w:t xml:space="preserve">  |  </w:t>
       </w:r>
@@ -561,14 +561,14 @@
     <w:p>
       <w:pPr>
         <w:pStyle w:val="ListBullet"/>
-        <w:spacing w:before="4" w:after="12" w:line="245" w:lineRule="auto"/>
+        <w:spacing w:before="8" w:after="18" w:line="252" w:lineRule="auto"/>
         <w:ind w:left="317" w:hanging="173"/>
       </w:pPr>
       <w:r>
         <w:rPr>
           <w:rFonts w:ascii="Arial" w:hAnsi="Arial"/>
           <w:color w:val="111111"/>
-          <w:sz w:val="17"/>
+          <w:sz w:val="18"/>
         </w:rPr>
         <w:t>Built a reproducible long-horizon RL credit-assignment artifact with finite-MDP audits, exact-gradient experiments, sequence-policy audits, 51 passing tests, a 32-page LaTeX paper, Zenodo DOI, and SHA-256 manifest.</w:t>
       </w:r>
@@ -576,7 +576,7 @@
     <w:p>
       <w:pPr>
         <w:keepNext/>
-        <w:spacing w:before="30" w:after="4" w:line="240" w:lineRule="auto"/>
+        <w:spacing w:before="56" w:after="16" w:line="240" w:lineRule="auto"/>
         <w:tabs>
           <w:tab w:val="right" w:pos="10800"/>
         </w:tabs>
@@ -586,7 +586,7 @@
           <w:rFonts w:ascii="Arial" w:hAnsi="Arial"/>
           <w:b/>
           <w:color w:val="111111"/>
-          <w:sz w:val="20"/>
+          <w:sz w:val="22"/>
         </w:rPr>
         <w:t>ML Fundamentals</w:t>
       </w:r>
@@ -594,14 +594,14 @@
     <w:p>
       <w:pPr>
         <w:keepNext/>
-        <w:spacing w:before="0" w:after="26" w:line="240" w:lineRule="auto"/>
+        <w:spacing w:before="0" w:after="40" w:line="240" w:lineRule="auto"/>
       </w:pPr>
       <w:r>
         <w:rPr>
           <w:rFonts w:ascii="Arial" w:hAnsi="Arial"/>
           <w:i/>
           <w:color w:val="555555"/>
-          <w:sz w:val="18"/>
+          <w:sz w:val="19"/>
         </w:rPr>
         <w:t>From-scratch implementations</w:t>
       </w:r>
@@ -609,7 +609,7 @@
         <w:rPr>
           <w:rFonts w:ascii="Arial" w:hAnsi="Arial"/>
           <w:color w:val="555555"/>
-          <w:sz w:val="17"/>
+          <w:sz w:val="18"/>
         </w:rPr>
         <w:t xml:space="preserve">  |  </w:t>
       </w:r>
@@ -629,14 +629,14 @@
     <w:p>
       <w:pPr>
         <w:pStyle w:val="ListBullet"/>
-        <w:spacing w:before="4" w:after="12" w:line="245" w:lineRule="auto"/>
+        <w:spacing w:before="8" w:after="18" w:line="252" w:lineRule="auto"/>
         <w:ind w:left="317" w:hanging="173"/>
       </w:pPr>
       <w:r>
         <w:rPr>
           <w:rFonts w:ascii="Arial" w:hAnsi="Arial"/>
           <w:color w:val="111111"/>
-          <w:sz w:val="17"/>
+          <w:sz w:val="18"/>
         </w:rPr>
         <w:t>Reimplemented GPT-2, Stable Diffusion, and an open-source AlphaEvolve from scratch to build first-principles understanding of model architectures and training loops.</w:t>
       </w:r>
@@ -644,7 +644,7 @@
     <w:p>
       <w:pPr>
         <w:keepNext/>
-        <w:spacing w:before="80" w:after="60" w:line="240" w:lineRule="auto"/>
+        <w:spacing w:before="120" w:after="80" w:line="240" w:lineRule="auto"/>
         <w:pBdr>
           <w:bottom w:val="single" w:sz="6" w:space="2" w:color="A0A0A0"/>
         </w:pBdr>
@@ -654,15 +654,15 @@
           <w:rFonts w:ascii="Arial" w:hAnsi="Arial"/>
           <w:b/>
           <w:color w:val="111111"/>
-          <w:sz w:val="21"/>
+          <w:sz w:val="22"/>
         </w:rPr>
-        <w:t>EXPERIENCE</w:t>
+        <w:t>EXPERIENCE &amp; LEADERSHIP</w:t>
       </w:r>
     </w:p>
     <w:p>
       <w:pPr>
         <w:keepNext/>
-        <w:spacing w:before="30" w:after="4" w:line="240" w:lineRule="auto"/>
+        <w:spacing w:before="56" w:after="16" w:line="240" w:lineRule="auto"/>
         <w:tabs>
           <w:tab w:val="right" w:pos="10800"/>
         </w:tabs>
@@ -672,7 +672,7 @@
           <w:rFonts w:ascii="Arial" w:hAnsi="Arial"/>
           <w:b/>
           <w:color w:val="111111"/>
-          <w:sz w:val="20"/>
+          <w:sz w:val="22"/>
         </w:rPr>
         <w:t>Founder &amp; Content Lead | Francesco Tech</w:t>
       </w:r>
@@ -680,7 +680,7 @@
         <w:rPr>
           <w:rFonts w:ascii="Arial" w:hAnsi="Arial"/>
           <w:color w:val="555555"/>
-          <w:sz w:val="18"/>
+          <w:sz w:val="19"/>
         </w:rPr>
         <w:tab/>
         <w:t>Mar 2020 - Present</w:t>
@@ -689,14 +689,14 @@
     <w:p>
       <w:pPr>
         <w:pStyle w:val="ListBullet"/>
-        <w:spacing w:before="4" w:after="12" w:line="245" w:lineRule="auto"/>
+        <w:spacing w:before="8" w:after="18" w:line="252" w:lineRule="auto"/>
         <w:ind w:left="317" w:hanging="173"/>
       </w:pPr>
       <w:r>
         <w:rPr>
           <w:rFonts w:ascii="Arial" w:hAnsi="Arial"/>
           <w:color w:val="111111"/>
-          <w:sz w:val="17"/>
+          <w:sz w:val="18"/>
         </w:rPr>
         <w:t>Built Italian tech media channels on Instagram and TikTok to 70,000+ followers and 4M+ views, shipping content continuously and iterating on audience feedback.</w:t>
       </w:r>
@@ -704,7 +704,49 @@
     <w:p>
       <w:pPr>
         <w:keepNext/>
-        <w:spacing w:before="80" w:after="60" w:line="240" w:lineRule="auto"/>
+        <w:spacing w:before="56" w:after="16" w:line="240" w:lineRule="auto"/>
+        <w:tabs>
+          <w:tab w:val="right" w:pos="10800"/>
+        </w:tabs>
+      </w:pPr>
+      <w:r>
+        <w:rPr>
+          <w:rFonts w:ascii="Arial" w:hAnsi="Arial"/>
+          <w:b/>
+          <w:color w:val="111111"/>
+          <w:sz w:val="22"/>
+        </w:rPr>
+        <w:t>Community Volunteer | ENSA &amp; ASS.A.P.L.I.</w:t>
+      </w:r>
+      <w:r>
+        <w:rPr>
+          <w:rFonts w:ascii="Arial" w:hAnsi="Arial"/>
+          <w:color w:val="555555"/>
+          <w:sz w:val="19"/>
+        </w:rPr>
+        <w:tab/>
+        <w:t>2015 - Present</w:t>
+      </w:r>
+    </w:p>
+    <w:p>
+      <w:pPr>
+        <w:pStyle w:val="ListBullet"/>
+        <w:spacing w:before="8" w:after="18" w:line="252" w:lineRule="auto"/>
+        <w:ind w:left="317" w:hanging="173"/>
+      </w:pPr>
+      <w:r>
+        <w:rPr>
+          <w:rFonts w:ascii="Arial" w:hAnsi="Arial"/>
+          <w:color w:val="111111"/>
+          <w:sz w:val="18"/>
+        </w:rPr>
+        <w:t>Supported environmental, civil-protection, social-solidarity, road-safety, and public-awareness initiatives, including pediatric-ward gift delivery and safe-driving education.</w:t>
+      </w:r>
+    </w:p>
+    <w:p>
+      <w:pPr>
+        <w:keepNext/>
+        <w:spacing w:before="120" w:after="80" w:line="240" w:lineRule="auto"/>
         <w:pBdr>
           <w:bottom w:val="single" w:sz="6" w:space="2" w:color="A0A0A0"/>
         </w:pBdr>
@@ -714,7 +756,7 @@
           <w:rFonts w:ascii="Arial" w:hAnsi="Arial"/>
           <w:b/>
           <w:color w:val="111111"/>
-          <w:sz w:val="21"/>
+          <w:sz w:val="22"/>
         </w:rPr>
         <w:t>TECHNICAL SKILLS</w:t>
       </w:r>
@@ -722,14 +764,14 @@
     <w:p>
       <w:pPr>
         <w:keepNext w:val="0"/>
-        <w:spacing w:before="4" w:after="6" w:line="240" w:lineRule="auto"/>
+        <w:spacing w:before="8" w:after="12" w:line="240" w:lineRule="auto"/>
       </w:pPr>
       <w:r>
         <w:rPr>
           <w:rFonts w:ascii="Arial" w:hAnsi="Arial"/>
           <w:b/>
           <w:color w:val="111111"/>
-          <w:sz w:val="18"/>
+          <w:sz w:val="19"/>
         </w:rPr>
         <w:t xml:space="preserve">Languages: </w:t>
       </w:r>
@@ -737,7 +779,7 @@
         <w:rPr>
           <w:rFonts w:ascii="Arial" w:hAnsi="Arial"/>
           <w:color w:val="111111"/>
-          <w:sz w:val="18"/>
+          <w:sz w:val="19"/>
         </w:rPr>
         <w:t>TypeScript, Python, JavaScript, Swift, SQL, Solidity, Rust basics, HTML/CSS</w:t>
       </w:r>
@@ -745,14 +787,14 @@
     <w:p>
       <w:pPr>
         <w:keepNext w:val="0"/>
-        <w:spacing w:before="4" w:after="6" w:line="240" w:lineRule="auto"/>
+        <w:spacing w:before="8" w:after="12" w:line="240" w:lineRule="auto"/>
       </w:pPr>
       <w:r>
         <w:rPr>
           <w:rFonts w:ascii="Arial" w:hAnsi="Arial"/>
           <w:b/>
           <w:color w:val="111111"/>
-          <w:sz w:val="18"/>
+          <w:sz w:val="19"/>
         </w:rPr>
         <w:t xml:space="preserve">AI/ML: </w:t>
       </w:r>
@@ -760,7 +802,7 @@
         <w:rPr>
           <w:rFonts w:ascii="Arial" w:hAnsi="Arial"/>
           <w:color w:val="111111"/>
-          <w:sz w:val="18"/>
+          <w:sz w:val="19"/>
         </w:rPr>
         <w:t>LLM agents, agent orchestration, RAG, evals, RL experiments, PyTorch basics, verifier workflows</w:t>
       </w:r>
@@ -768,14 +810,14 @@
     <w:p>
       <w:pPr>
         <w:keepNext w:val="0"/>
-        <w:spacing w:before="4" w:after="6" w:line="240" w:lineRule="auto"/>
+        <w:spacing w:before="8" w:after="12" w:line="240" w:lineRule="auto"/>
       </w:pPr>
       <w:r>
         <w:rPr>
           <w:rFonts w:ascii="Arial" w:hAnsi="Arial"/>
           <w:b/>
           <w:color w:val="111111"/>
-          <w:sz w:val="18"/>
+          <w:sz w:val="19"/>
         </w:rPr>
         <w:t xml:space="preserve">Frontend: </w:t>
       </w:r>
@@ -783,7 +825,7 @@
         <w:rPr>
           <w:rFonts w:ascii="Arial" w:hAnsi="Arial"/>
           <w:color w:val="111111"/>
-          <w:sz w:val="18"/>
+          <w:sz w:val="19"/>
         </w:rPr>
         <w:t>React, Next.js, Tailwind CSS, Expo, React Native, Electron</w:t>
       </w:r>
@@ -791,14 +833,14 @@
     <w:p>
       <w:pPr>
         <w:keepNext w:val="0"/>
-        <w:spacing w:before="4" w:after="6" w:line="240" w:lineRule="auto"/>
+        <w:spacing w:before="8" w:after="12" w:line="240" w:lineRule="auto"/>
       </w:pPr>
       <w:r>
         <w:rPr>
           <w:rFonts w:ascii="Arial" w:hAnsi="Arial"/>
           <w:b/>
           <w:color w:val="111111"/>
-          <w:sz w:val="18"/>
+          <w:sz w:val="19"/>
         </w:rPr>
         <w:t xml:space="preserve">Backend/Data: </w:t>
       </w:r>
@@ -806,7 +848,7 @@
         <w:rPr>
           <w:rFonts w:ascii="Arial" w:hAnsi="Arial"/>
           <w:color w:val="111111"/>
-          <w:sz w:val="18"/>
+          <w:sz w:val="19"/>
         </w:rPr>
         <w:t>Node.js, Express, FastAPI, Supabase, PostgreSQL, REST APIs, Cloudflare R2, Stripe</w:t>
       </w:r>
@@ -814,14 +856,14 @@
     <w:p>
       <w:pPr>
         <w:keepNext w:val="0"/>
-        <w:spacing w:before="4" w:after="6" w:line="240" w:lineRule="auto"/>
+        <w:spacing w:before="8" w:after="12" w:line="240" w:lineRule="auto"/>
       </w:pPr>
       <w:r>
         <w:rPr>
           <w:rFonts w:ascii="Arial" w:hAnsi="Arial"/>
           <w:b/>
           <w:color w:val="111111"/>
-          <w:sz w:val="18"/>
+          <w:sz w:val="19"/>
         </w:rPr>
         <w:t xml:space="preserve">Tools: </w:t>
       </w:r>
@@ -829,7 +871,7 @@
         <w:rPr>
           <w:rFonts w:ascii="Arial" w:hAnsi="Arial"/>
           <w:color w:val="111111"/>
-          <w:sz w:val="18"/>
+          <w:sz w:val="19"/>
         </w:rPr>
         <w:t>Git, Docker, Linux, GitHub Actions, Playwright, LaTeX, Vercel, Cloudflare</w:t>
       </w:r>
@@ -837,7 +879,7 @@
     <w:p>
       <w:pPr>
         <w:keepNext/>
-        <w:spacing w:before="80" w:after="60" w:line="240" w:lineRule="auto"/>
+        <w:spacing w:before="120" w:after="80" w:line="240" w:lineRule="auto"/>
         <w:pBdr>
           <w:bottom w:val="single" w:sz="6" w:space="2" w:color="A0A0A0"/>
         </w:pBdr>
@@ -847,7 +889,7 @@
           <w:rFonts w:ascii="Arial" w:hAnsi="Arial"/>
           <w:b/>
           <w:color w:val="111111"/>
-          <w:sz w:val="21"/>
+          <w:sz w:val="22"/>
         </w:rPr>
         <w:t>AWARDS &amp; LANGUAGES</w:t>
       </w:r>
@@ -855,14 +897,14 @@
     <w:p>
       <w:pPr>
         <w:pStyle w:val="ListBullet"/>
-        <w:spacing w:before="4" w:after="4" w:line="245" w:lineRule="auto"/>
+        <w:spacing w:before="8" w:after="12" w:line="245" w:lineRule="auto"/>
         <w:ind w:left="317" w:hanging="173"/>
       </w:pPr>
       <w:r>
         <w:rPr>
           <w:rFonts w:ascii="Arial" w:hAnsi="Arial"/>
           <w:color w:val="111111"/>
-          <w:sz w:val="17"/>
+          <w:sz w:val="19"/>
         </w:rPr>
         <w:t>OII Italian Olympiad in Informatics: participant</w:t>
       </w:r>
@@ -870,21 +912,21 @@
     <w:p>
       <w:pPr>
         <w:pStyle w:val="ListBullet"/>
-        <w:spacing w:before="4" w:after="0" w:line="245" w:lineRule="auto"/>
+        <w:spacing w:before="8" w:after="12" w:line="245" w:lineRule="auto"/>
         <w:ind w:left="317" w:hanging="173"/>
       </w:pPr>
       <w:r>
         <w:rPr>
           <w:rFonts w:ascii="Arial" w:hAnsi="Arial"/>
           <w:color w:val="111111"/>
-          <w:sz w:val="17"/>
+          <w:sz w:val="19"/>
         </w:rPr>
         <w:t>Languages: Italian (native), English (intermediate), French (basic), Spanish (basic)</w:t>
       </w:r>
     </w:p>
     <w:sectPr>
       <w:pgSz w:w="12240" w:h="15840"/>
-      <w:pgMar w:top="691" w:right="720" w:bottom="691" w:left="720" w:header="720" w:footer="720" w:gutter="0"/>
+      <w:pgMar w:top="720" w:right="800" w:bottom="720" w:left="800" w:header="720" w:footer="720" w:gutter="0"/>
       <w:cols w:space="720"/>
       <w:docGrid w:linePitch="360"/>
     </w:sectPr>

</xml_diff>